<commit_message>
document error and debug, update manuscript
</commit_message>
<xml_diff>
--- a/paper/Martinelli_etal_manuscript.docx
+++ b/paper/Martinelli_etal_manuscript.docx
@@ -8,7 +8,7 @@
       </w:pPr>
       <w:bookmarkStart w:id="0" w:name="Xcbb481a8b35053bb78d30368afce6a870f54469"/>
       <w:r>
-        <w:t>DELT-Hit: An end-to-end computational framework for DNA-encoded chemical library analysis</w:t>
+        <w:t>An end-to-end computational framework for DNA-encoded chemical library analysis</w:t>
       </w:r>
     </w:p>
     <w:p>
@@ -24,23 +24,7 @@
         <w:pStyle w:val="FirstParagraph"/>
       </w:pPr>
       <w:r>
-        <w:t xml:space="preserve">Adriano Martinelli+*, Alice Lessing+, Gary </w:t>
-      </w:r>
-      <w:proofErr w:type="spellStart"/>
-      <w:r>
-        <w:t>Hoppeler</w:t>
-      </w:r>
-      <w:proofErr w:type="spellEnd"/>
-      <w:r>
-        <w:t xml:space="preserve">, Andreas Gloger, Louise </w:t>
-      </w:r>
-      <w:proofErr w:type="spellStart"/>
-      <w:r>
-        <w:t>Plais</w:t>
-      </w:r>
-      <w:proofErr w:type="spellEnd"/>
-      <w:r>
-        <w:t xml:space="preserve">, </w:t>
+        <w:t xml:space="preserve">Adriano Martinelli+*, Alice Lessing+, Gary Hoppeler, Andreas Gloger, Louise Plais, </w:t>
       </w:r>
       <w:r>
         <w:br/>
@@ -92,14 +76,7 @@
           <w:sz w:val="20"/>
           <w:szCs w:val="20"/>
         </w:rPr>
-        <w:t>+</w:t>
-      </w:r>
-      <w:r>
-        <w:rPr>
-          <w:sz w:val="20"/>
-          <w:szCs w:val="20"/>
-        </w:rPr>
-        <w:t xml:space="preserve"> these authors contributed equally</w:t>
+        <w:t>+ these authors contributed equally</w:t>
       </w:r>
     </w:p>
     <w:p>
@@ -143,7 +120,6 @@
         <w:rPr>
           <w:sz w:val="20"/>
           <w:szCs w:val="20"/>
-          <w:lang w:val="de-CH"/>
         </w:rPr>
       </w:pPr>
       <w:r>
@@ -158,102 +134,42 @@
         <w:rPr>
           <w:sz w:val="20"/>
           <w:szCs w:val="20"/>
-          <w:lang w:val="de-CH"/>
-        </w:rPr>
-        <w:t xml:space="preserve">Adriano Martinelli, </w:t>
-      </w:r>
-      <w:proofErr w:type="spellStart"/>
+        </w:rPr>
+        <w:t xml:space="preserve">Adriano Martinelli, e-mail: </w:t>
+      </w:r>
       <w:r>
         <w:rPr>
           <w:sz w:val="20"/>
           <w:szCs w:val="20"/>
-          <w:lang w:val="de-CH"/>
-        </w:rPr>
-        <w:t>e-mail</w:t>
-      </w:r>
-      <w:proofErr w:type="spellEnd"/>
+        </w:rPr>
+        <w:t>adriano.martinelli@pharma.ethz.ch</w:t>
+      </w:r>
       <w:r>
         <w:rPr>
           <w:sz w:val="20"/>
           <w:szCs w:val="20"/>
-          <w:lang w:val="de-CH"/>
-        </w:rPr>
-        <w:t>:</w:t>
+        </w:rPr>
+        <w:br/>
+        <w:t xml:space="preserve"> </w:t>
       </w:r>
       <w:r>
         <w:rPr>
           <w:sz w:val="20"/>
           <w:szCs w:val="20"/>
-          <w:lang w:val="de-CH"/>
-        </w:rPr>
-        <w:t xml:space="preserve"> </w:t>
+        </w:rPr>
+        <w:t xml:space="preserve">Jörg Scheuermann, email: </w:t>
       </w:r>
       <w:r>
         <w:rPr>
           <w:sz w:val="20"/>
           <w:szCs w:val="20"/>
-          <w:lang w:val="de-CH"/>
-        </w:rPr>
-        <w:t>adriano.martinelli@pharma.ethz.ch</w:t>
-      </w:r>
-      <w:r>
-        <w:rPr>
-          <w:sz w:val="20"/>
-          <w:szCs w:val="20"/>
-          <w:lang w:val="de-CH"/>
-        </w:rPr>
-        <w:br/>
-        <w:t xml:space="preserve"> </w:t>
-      </w:r>
-      <w:r>
-        <w:rPr>
-          <w:sz w:val="20"/>
-          <w:szCs w:val="20"/>
-          <w:lang w:val="de-CH"/>
-        </w:rPr>
-        <w:t xml:space="preserve">Jörg Scheuermann, </w:t>
-      </w:r>
-      <w:proofErr w:type="gramStart"/>
-      <w:r>
-        <w:rPr>
-          <w:sz w:val="20"/>
-          <w:szCs w:val="20"/>
-          <w:lang w:val="de-CH"/>
-        </w:rPr>
-        <w:t>email</w:t>
-      </w:r>
-      <w:proofErr w:type="gramEnd"/>
-      <w:r>
-        <w:rPr>
-          <w:sz w:val="20"/>
-          <w:szCs w:val="20"/>
-          <w:lang w:val="de-CH"/>
-        </w:rPr>
-        <w:t xml:space="preserve">: </w:t>
-      </w:r>
-      <w:r>
-        <w:rPr>
-          <w:sz w:val="20"/>
-          <w:szCs w:val="20"/>
-          <w:lang w:val="de-CH"/>
-        </w:rPr>
-        <w:t>j</w:t>
-      </w:r>
-      <w:r>
-        <w:rPr>
-          <w:sz w:val="20"/>
-          <w:szCs w:val="20"/>
-          <w:lang w:val="de-CH"/>
-        </w:rPr>
-        <w:t>oerg.scheuermann@pharma.ethz.ch</w:t>
+        </w:rPr>
+        <w:t>joerg.scheuermann@pharma.ethz.ch</w:t>
       </w:r>
     </w:p>
     <w:p>
       <w:pPr>
         <w:pStyle w:val="Heading2"/>
-        <w:rPr>
-          <w:lang w:val="de-CH"/>
-        </w:rPr>
       </w:pPr>
       <w:bookmarkStart w:id="1" w:name="authors"/>
       <w:bookmarkEnd w:id="1"/>
@@ -1925,7 +1841,20 @@
         <w:spacing w:before="180" w:after="180"/>
       </w:pPr>
       <w:r>
-        <w:t xml:space="preserve">Considering the large volume of data generated, the computational analysis of DEL screening data is a critical factor, requiring sophisticated integration of genomics, cheminformatics, and statistical analysis workflows that are currently not publicly available. DEL screening data presents unique </w:t>
+        <w:t xml:space="preserve">Considering the large volume of data generated, the computational analysis of DEL screening data is a critical factor, requiring sophisticated integration of genomics, cheminformatics, and statistical analysis </w:t>
+      </w:r>
+      <w:ins w:id="5" w:author="Martinelli, Adriano Luca (DBMR)" w:date="2026-04-29T20:26:00Z" w16du:dateUtc="2026-04-29T23:26:00Z">
+        <w:r>
+          <w:t>workflows for which few open-source, integrated solutions currently exist</w:t>
+        </w:r>
+      </w:ins>
+      <w:del w:id="6" w:author="Martinelli, Adriano Luca (DBMR)" w:date="2026-04-29T20:26:00Z" w16du:dateUtc="2026-04-29T23:26:00Z">
+        <w:r>
+          <w:delText>workflows that are currently not publicly available</w:delText>
+        </w:r>
+      </w:del>
+      <w:r>
+        <w:t xml:space="preserve">. DEL screening data presents unique </w:t>
       </w:r>
       <w:r>
         <w:t>opportunities for machine learning</w:t>
@@ -2706,7 +2635,7 @@
                     </pic:cNvPicPr>
                   </pic:nvPicPr>
                   <pic:blipFill>
-                    <a:blip r:embed="rId6"/>
+                    <a:blip r:embed="rId8"/>
                     <a:stretch>
                       <a:fillRect/>
                     </a:stretch>
@@ -2883,7 +2812,25 @@
       </w:r>
       <w:proofErr w:type="spellEnd"/>
       <w:r>
-        <w:t xml:space="preserve"> of selection fingerprints and enables their interactive exploration. Finally, DELT-Hit provides the obtained enrichment data and representations of library compounds as Morgan fingerprints and BERT embeddings in a format ready for downstream machine learning applications.  </w:t>
+        <w:t xml:space="preserve"> of selection fingerprints and enables their interactive exploration. Finally, DELT-Hit provides the obtained enrichment data and representations of library compounds as Morgan fingerprints and BERT embeddings in a format ready for downstream machine learning applications.</w:t>
+      </w:r>
+      <w:ins w:id="7" w:author="Martinelli, Adriano Luca (DBMR)" w:date="2026-04-29T20:27:00Z" w16du:dateUtc="2026-04-29T23:27:00Z">
+        <w:r>
+          <w:t xml:space="preserve"> Solid arrows indicate data flow between modules; </w:t>
+        </w:r>
+      </w:ins>
+      <w:ins w:id="8" w:author="Martinelli, Adriano Luca (DBMR)" w:date="2026-04-29T20:34:00Z" w16du:dateUtc="2026-04-29T23:34:00Z">
+        <w:r>
+          <w:t xml:space="preserve">green rectangles represent wet lab steps, </w:t>
+        </w:r>
+      </w:ins>
+      <w:ins w:id="9" w:author="Martinelli, Adriano Luca (DBMR)" w:date="2026-04-29T20:27:00Z" w16du:dateUtc="2026-04-29T23:27:00Z">
+        <w:r>
+          <w:t>blue rectangles represent processing steps; grey boxes indicate input/output file types.</w:t>
+        </w:r>
+      </w:ins>
+      <w:r>
+        <w:t xml:space="preserve">  </w:t>
       </w:r>
     </w:p>
     <w:p>
@@ -3161,11 +3108,11 @@
       <w:pPr>
         <w:pStyle w:val="BodyText"/>
       </w:pPr>
-      <w:bookmarkStart w:id="5" w:name="development-of-the-protocol"/>
+      <w:bookmarkStart w:id="10" w:name="development-of-the-protocol"/>
       <w:r>
         <w:t>This modular architecture enables users to execute complete workflows for routine analysis or utilize individual components for specialized applications. Each stage of the pipeline produces an executable script, allowing users to easily adapt the workflow to more complex experimental designs and custom settings, while maintaining reproducibility through standardized configuration files and output formats. The protocol has been successfully validated across diverse DEL architectures including multi-cycle libraries, hybridized libraries combining independent synthetic routes, and large-scale pharmaceutical screens with millions of compounds.</w:t>
       </w:r>
-      <w:bookmarkEnd w:id="5"/>
+      <w:bookmarkEnd w:id="10"/>
     </w:p>
     <w:p>
       <w:pPr>
@@ -3426,23 +3373,7 @@
       </w:r>
       <w:proofErr w:type="spellEnd"/>
       <w:r>
-        <w:t xml:space="preserve"> thrombin inhibitor from the conformationally restrained macrocyclic subset of the ESAC </w:t>
-      </w:r>
-      <w:proofErr w:type="gramStart"/>
-      <w:r>
-        <w:t>library,  a</w:t>
-      </w:r>
-      <w:proofErr w:type="gramEnd"/>
-      <w:r>
-        <w:t xml:space="preserve"> more flexible streptavidin binder from the semi-closed conformation, as well </w:t>
-      </w:r>
-      <w:proofErr w:type="gramStart"/>
-      <w:r>
-        <w:t>as  binders</w:t>
-      </w:r>
-      <w:proofErr w:type="gramEnd"/>
-      <w:r>
-        <w:t xml:space="preserve"> to human alkaline phosphatase (PLAP) from the open, conventional dual-display setup. The results obtained from this approach demonstrated the utility of dual-display DEL technology for facilitating the de novo discovery of peptide ligands through flexibility-tuning</w:t>
+        <w:t xml:space="preserve"> thrombin inhibitor from the conformationally restrained macrocyclic subset of the ESAC library,  a more flexible streptavidin binder from the semi-closed conformation, as well as  binders to human alkaline phosphatase (PLAP) from the open, conventional dual-display setup. The results obtained from this approach demonstrated the utility of dual-display DEL technology for facilitating the de novo discovery of peptide ligands through flexibility-tuning</w:t>
       </w:r>
       <w:r>
         <w:fldChar w:fldCharType="begin">
@@ -3580,8 +3511,8 @@
       <w:pPr>
         <w:pStyle w:val="Heading3"/>
       </w:pPr>
-      <w:bookmarkStart w:id="6" w:name="applications-of-the-method"/>
-      <w:bookmarkEnd w:id="6"/>
+      <w:bookmarkStart w:id="11" w:name="applications-of-the-method"/>
+      <w:bookmarkEnd w:id="11"/>
       <w:r>
         <w:t>Limitations</w:t>
       </w:r>
@@ -3614,7 +3545,7 @@
           <w:numId w:val="21"/>
         </w:numPr>
       </w:pPr>
-      <w:bookmarkStart w:id="7" w:name="limitations"/>
+      <w:bookmarkStart w:id="12" w:name="limitations"/>
       <w:r>
         <w:t>Library complexity: DELT-Hit supports arbitrary sequences of chemical reactions, provided that each synthetic route yields a single, well-defined final product, as is expected for high-quality DNA-encoded libraries. Libraries with complex architectures, such as non-standard reaction schemes, atypical building block representations, or unconventional precursor handling may require additional custom configuration and validation. In particular, the library enumeration step assumes accurate specification of reaction chemistry using reaction SM</w:t>
       </w:r>
@@ -3630,7 +3561,7 @@
       <w:r>
         <w:t xml:space="preserve"> may require advanced cheminformatics expertise to ensure correct product generation and structure reconstruction.</w:t>
       </w:r>
-      <w:bookmarkEnd w:id="7"/>
+      <w:bookmarkEnd w:id="12"/>
     </w:p>
     <w:p>
       <w:pPr>
@@ -3662,8 +3593,18 @@
         <w:pStyle w:val="BodyText"/>
       </w:pPr>
       <w:r>
-        <w:t>To our knowledge, the only other open-source DEL framework introduced to date is DELi</w:t>
-      </w:r>
+        <w:t xml:space="preserve">To our knowledge, </w:t>
+      </w:r>
+      <w:ins w:id="13" w:author="Martinelli, Adriano Luca (DBMR)" w:date="2026-04-29T20:25:00Z" w16du:dateUtc="2026-04-29T23:25:00Z">
+        <w:r>
+          <w:t>another open-source DEL framework is DELi</w:t>
+        </w:r>
+      </w:ins>
+      <w:del w:id="14" w:author="Martinelli, Adriano Luca (DBMR)" w:date="2026-04-29T20:25:00Z" w16du:dateUtc="2026-04-29T23:25:00Z">
+        <w:r>
+          <w:delText>the only other open-source DEL framework introduced to date is DELi</w:delText>
+        </w:r>
+      </w:del>
       <w:r>
         <w:fldChar w:fldCharType="begin"/>
       </w:r>
@@ -3683,8 +3624,18 @@
       <w:r>
         <w:fldChar w:fldCharType="end"/>
       </w:r>
-      <w:r>
-        <w:t xml:space="preserve">, that addresses several core aspects of DEL informatics, including barcode decoding, enrichment analysis, and library enumeration. </w:t>
+      <w:ins w:id="15" w:author="Martinelli, Adriano Luca (DBMR)" w:date="2026-04-29T20:25:00Z" w16du:dateUtc="2026-04-29T23:25:00Z">
+        <w:r>
+          <w:t>, which addresses several core aspects</w:t>
+        </w:r>
+      </w:ins>
+      <w:del w:id="16" w:author="Martinelli, Adriano Luca (DBMR)" w:date="2026-04-29T20:25:00Z" w16du:dateUtc="2026-04-29T23:25:00Z">
+        <w:r>
+          <w:delText>, that addresses several core aspects</w:delText>
+        </w:r>
+      </w:del>
+      <w:r>
+        <w:t xml:space="preserve"> of DEL informatics, including barcode decoding, enrichment analysis, and library enumeration. </w:t>
       </w:r>
       <w:proofErr w:type="spellStart"/>
       <w:r>
@@ -3780,10 +3731,10 @@
       <w:pPr>
         <w:pStyle w:val="Heading2"/>
       </w:pPr>
-      <w:bookmarkStart w:id="8" w:name="introduction"/>
-      <w:bookmarkStart w:id="9" w:name="overview-of-the-procedure"/>
-      <w:bookmarkEnd w:id="8"/>
-      <w:bookmarkEnd w:id="9"/>
+      <w:bookmarkStart w:id="17" w:name="introduction"/>
+      <w:bookmarkStart w:id="18" w:name="overview-of-the-procedure"/>
+      <w:bookmarkEnd w:id="17"/>
+      <w:bookmarkEnd w:id="18"/>
       <w:r>
         <w:t>Experimental design</w:t>
       </w:r>
@@ -3876,8 +3827,8 @@
       <w:pPr>
         <w:pStyle w:val="Heading3"/>
       </w:pPr>
-      <w:bookmarkStart w:id="10" w:name="input-requirements"/>
-      <w:bookmarkEnd w:id="10"/>
+      <w:bookmarkStart w:id="19" w:name="input-requirements"/>
+      <w:bookmarkEnd w:id="19"/>
       <w:r>
         <w:t>Library architecture considerations</w:t>
       </w:r>
@@ -3947,8 +3898,8 @@
       <w:pPr>
         <w:pStyle w:val="Heading3"/>
       </w:pPr>
-      <w:bookmarkStart w:id="11" w:name="library-architecture-considerations"/>
-      <w:bookmarkEnd w:id="11"/>
+      <w:bookmarkStart w:id="20" w:name="library-architecture-considerations"/>
+      <w:bookmarkEnd w:id="20"/>
       <w:r>
         <w:t>Library chemistry and reaction definition</w:t>
       </w:r>
@@ -4003,8 +3954,8 @@
       <w:pPr>
         <w:pStyle w:val="Heading3"/>
       </w:pPr>
-      <w:bookmarkStart w:id="12" w:name="X2cef6e60534e65075faa0785115402f7d968eda"/>
-      <w:bookmarkEnd w:id="12"/>
+      <w:bookmarkStart w:id="21" w:name="X2cef6e60534e65075faa0785115402f7d968eda"/>
+      <w:bookmarkEnd w:id="21"/>
       <w:r>
         <w:lastRenderedPageBreak/>
         <w:t>Quality control parameters</w:t>
@@ -4173,10 +4124,10 @@
       <w:pPr>
         <w:pStyle w:val="Heading2"/>
       </w:pPr>
-      <w:bookmarkStart w:id="13" w:name="experimental-design"/>
-      <w:bookmarkStart w:id="14" w:name="quality-control-parameters"/>
-      <w:bookmarkEnd w:id="13"/>
-      <w:bookmarkEnd w:id="14"/>
+      <w:bookmarkStart w:id="22" w:name="experimental-design"/>
+      <w:bookmarkStart w:id="23" w:name="quality-control-parameters"/>
+      <w:bookmarkEnd w:id="22"/>
+      <w:bookmarkEnd w:id="23"/>
     </w:p>
     <w:p>
       <w:pPr>
@@ -4286,8 +4237,8 @@
       <w:pPr>
         <w:pStyle w:val="Heading3"/>
       </w:pPr>
-      <w:bookmarkStart w:id="15" w:name="equipment"/>
-      <w:bookmarkEnd w:id="15"/>
+      <w:bookmarkStart w:id="24" w:name="equipment"/>
+      <w:bookmarkEnd w:id="24"/>
       <w:r>
         <w:t>Software dependencies</w:t>
       </w:r>
@@ -4583,8 +4534,8 @@
       <w:pPr>
         <w:pStyle w:val="Heading3"/>
       </w:pPr>
-      <w:bookmarkStart w:id="16" w:name="software-dependencies"/>
-      <w:bookmarkEnd w:id="16"/>
+      <w:bookmarkStart w:id="25" w:name="software-dependencies"/>
+      <w:bookmarkEnd w:id="25"/>
     </w:p>
     <w:p>
       <w:pPr>
@@ -5273,8 +5224,8 @@
       <w:pPr>
         <w:pStyle w:val="Heading3"/>
       </w:pPr>
-      <w:bookmarkStart w:id="17" w:name="input-file-preparation"/>
-      <w:bookmarkEnd w:id="17"/>
+      <w:bookmarkStart w:id="26" w:name="input-file-preparation"/>
+      <w:bookmarkEnd w:id="26"/>
     </w:p>
     <w:p>
       <w:pPr>
@@ -5419,8 +5370,8 @@
       <w:pPr>
         <w:pStyle w:val="Heading4"/>
       </w:pPr>
-      <w:bookmarkStart w:id="18" w:name="X450531edde3ff1039ef30d32ebab957aa499e7b"/>
-      <w:bookmarkEnd w:id="18"/>
+      <w:bookmarkStart w:id="27" w:name="X450531edde3ff1039ef30d32ebab957aa499e7b"/>
+      <w:bookmarkEnd w:id="27"/>
       <w:r>
         <w:t>Step 2: Environment setup with Conda</w:t>
       </w:r>
@@ -5625,8 +5576,8 @@
       <w:pPr>
         <w:pStyle w:val="Heading4"/>
       </w:pPr>
-      <w:bookmarkStart w:id="19" w:name="step-2-environment-setup-with-conda"/>
-      <w:bookmarkEnd w:id="19"/>
+      <w:bookmarkStart w:id="28" w:name="step-2-environment-setup-with-conda"/>
+      <w:bookmarkEnd w:id="28"/>
       <w:r>
         <w:t>Step 3: R environment configuration</w:t>
       </w:r>
@@ -5796,8 +5747,8 @@
       <w:pPr>
         <w:pStyle w:val="Heading4"/>
       </w:pPr>
-      <w:bookmarkStart w:id="20" w:name="step-3-r-environment-configuration"/>
-      <w:bookmarkEnd w:id="20"/>
+      <w:bookmarkStart w:id="29" w:name="step-3-r-environment-configuration"/>
+      <w:bookmarkEnd w:id="29"/>
       <w:r>
         <w:t>Step 4: Installation verification</w:t>
       </w:r>
@@ -5926,10 +5877,10 @@
       <w:pPr>
         <w:pStyle w:val="Heading2"/>
       </w:pPr>
-      <w:bookmarkStart w:id="21" w:name="materials"/>
-      <w:bookmarkStart w:id="22" w:name="step-4-installation-verification"/>
-      <w:bookmarkEnd w:id="21"/>
-      <w:bookmarkEnd w:id="22"/>
+      <w:bookmarkStart w:id="30" w:name="materials"/>
+      <w:bookmarkStart w:id="31" w:name="step-4-installation-verification"/>
+      <w:bookmarkEnd w:id="30"/>
+      <w:bookmarkEnd w:id="31"/>
       <w:r>
         <w:t>Procedure</w:t>
       </w:r>
@@ -6276,8 +6227,8 @@
       <w:pPr>
         <w:pStyle w:val="Heading5"/>
       </w:pPr>
-      <w:bookmarkStart w:id="23" w:name="Xb402986ec565a249e1c0ce45e2cf0c618a6b5fc"/>
-      <w:bookmarkEnd w:id="23"/>
+      <w:bookmarkStart w:id="32" w:name="Xb402986ec565a249e1c0ce45e2cf0c618a6b5fc"/>
+      <w:bookmarkEnd w:id="32"/>
       <w:r>
         <w:t xml:space="preserve">1.2 Create the </w:t>
       </w:r>
@@ -7299,8 +7250,8 @@
       <w:pPr>
         <w:pStyle w:val="Heading5"/>
       </w:pPr>
-      <w:bookmarkStart w:id="24" w:name="X510792200dabf2aae0da5f850f832f5d6cea4f8"/>
-      <w:bookmarkEnd w:id="24"/>
+      <w:bookmarkStart w:id="33" w:name="X510792200dabf2aae0da5f850f832f5d6cea4f8"/>
+      <w:bookmarkEnd w:id="33"/>
       <w:r>
         <w:t xml:space="preserve">1.3 Create the </w:t>
       </w:r>
@@ -8168,8 +8119,8 @@
       <w:pPr>
         <w:pStyle w:val="Heading5"/>
       </w:pPr>
-      <w:bookmarkStart w:id="25" w:name="X35d8184db80d6bfa8d6eeac5467de429ac47bab"/>
-      <w:bookmarkEnd w:id="25"/>
+      <w:bookmarkStart w:id="34" w:name="X35d8184db80d6bfa8d6eeac5467de429ac47bab"/>
+      <w:bookmarkEnd w:id="34"/>
       <w:r>
         <w:t xml:space="preserve">1.4 Create the </w:t>
       </w:r>
@@ -8448,10 +8399,10 @@
       <w:pPr>
         <w:pStyle w:val="Heading4"/>
       </w:pPr>
-      <w:bookmarkStart w:id="26" w:name="step-1--prepare-excel-configuration-file"/>
-      <w:bookmarkStart w:id="27" w:name="Xe55b94e17f860d0bafc7f01dbe7ae0c214b100a"/>
-      <w:bookmarkEnd w:id="26"/>
-      <w:bookmarkEnd w:id="27"/>
+      <w:bookmarkStart w:id="35" w:name="step-1--prepare-excel-configuration-file"/>
+      <w:bookmarkStart w:id="36" w:name="Xe55b94e17f860d0bafc7f01dbe7ae0c214b100a"/>
+      <w:bookmarkEnd w:id="35"/>
+      <w:bookmarkEnd w:id="36"/>
       <w:r>
         <w:t>Step 2 | Define chemical building blocks and reactions</w:t>
       </w:r>
@@ -9069,8 +9020,8 @@
       <w:pPr>
         <w:pStyle w:val="Heading5"/>
       </w:pPr>
-      <w:bookmarkStart w:id="28" w:name="Xa8bbb1502252db6f3ff9cf343ce7640eccfa09e"/>
-      <w:bookmarkEnd w:id="28"/>
+      <w:bookmarkStart w:id="37" w:name="Xa8bbb1502252db6f3ff9cf343ce7640eccfa09e"/>
+      <w:bookmarkEnd w:id="37"/>
     </w:p>
     <w:p>
       <w:pPr>
@@ -9540,8 +9491,8 @@
       <w:pPr>
         <w:pStyle w:val="Heading5"/>
       </w:pPr>
-      <w:bookmarkStart w:id="29" w:name="X314196e3f0892791d95bfbd1adcad32a9b1963a"/>
-      <w:bookmarkEnd w:id="29"/>
+      <w:bookmarkStart w:id="38" w:name="X314196e3f0892791d95bfbd1adcad32a9b1963a"/>
+      <w:bookmarkEnd w:id="38"/>
       <w:r>
         <w:t xml:space="preserve">2.3 Create the </w:t>
       </w:r>
@@ -9689,10 +9640,10 @@
       <w:pPr>
         <w:pStyle w:val="Heading4"/>
       </w:pPr>
-      <w:bookmarkStart w:id="30" w:name="X4e937976f44745a3aa48a2ddac517bc6499031f"/>
-      <w:bookmarkStart w:id="31" w:name="X43502e1b3b407be0c315c4dd44812d281d0ffbe"/>
-      <w:bookmarkEnd w:id="30"/>
-      <w:bookmarkEnd w:id="31"/>
+      <w:bookmarkStart w:id="39" w:name="X4e937976f44745a3aa48a2ddac517bc6499031f"/>
+      <w:bookmarkStart w:id="40" w:name="X43502e1b3b407be0c315c4dd44812d281d0ffbe"/>
+      <w:bookmarkEnd w:id="39"/>
+      <w:bookmarkEnd w:id="40"/>
       <w:r>
         <w:t>2.4 Create the additional reaction steps</w:t>
       </w:r>
@@ -10423,10 +10374,10 @@
       <w:pPr>
         <w:pStyle w:val="Heading3"/>
       </w:pPr>
-      <w:bookmarkStart w:id="32" w:name="Xcaff30bb8061e2135f1ced3a43768c2b9b330eb"/>
-      <w:bookmarkStart w:id="33" w:name="step-3--generate-configuration-file"/>
-      <w:bookmarkEnd w:id="32"/>
-      <w:bookmarkEnd w:id="33"/>
+      <w:bookmarkStart w:id="41" w:name="Xcaff30bb8061e2135f1ced3a43768c2b9b330eb"/>
+      <w:bookmarkStart w:id="42" w:name="step-3--generate-configuration-file"/>
+      <w:bookmarkEnd w:id="41"/>
+      <w:bookmarkEnd w:id="42"/>
       <w:r>
         <w:t>Phase 2: Chemical library enumeration and analysis • TIMING 10 min - 2 h</w:t>
       </w:r>
@@ -10731,7 +10682,7 @@
                     </pic:cNvPicPr>
                   </pic:nvPicPr>
                   <pic:blipFill>
-                    <a:blip r:embed="rId7"/>
+                    <a:blip r:embed="rId9"/>
                     <a:stretch>
                       <a:fillRect/>
                     </a:stretch>
@@ -10877,8 +10828,8 @@
       <w:pPr>
         <w:pStyle w:val="Heading4"/>
       </w:pPr>
-      <w:bookmarkStart w:id="34" w:name="Xa4a186ba0c8dda909d08f38ea23b89c1272112b"/>
-      <w:bookmarkEnd w:id="34"/>
+      <w:bookmarkStart w:id="43" w:name="Xa4a186ba0c8dda909d08f38ea23b89c1272112b"/>
+      <w:bookmarkEnd w:id="43"/>
     </w:p>
     <w:p>
       <w:pPr>
@@ -11100,7 +11051,7 @@
                     </pic:cNvPicPr>
                   </pic:nvPicPr>
                   <pic:blipFill>
-                    <a:blip r:embed="rId8"/>
+                    <a:blip r:embed="rId10"/>
                     <a:stretch>
                       <a:fillRect/>
                     </a:stretch>
@@ -11160,8 +11111,8 @@
       <w:pPr>
         <w:pStyle w:val="Heading4"/>
       </w:pPr>
-      <w:bookmarkStart w:id="35" w:name="X0702c1a117e70256178a8648b7f22525f34b502"/>
-      <w:bookmarkEnd w:id="35"/>
+      <w:bookmarkStart w:id="44" w:name="X0702c1a117e70256178a8648b7f22525f34b502"/>
+      <w:bookmarkEnd w:id="44"/>
       <w:r>
         <w:lastRenderedPageBreak/>
         <w:t>Step 6 | Generate molecular representations for machine learning</w:t>
@@ -11377,10 +11328,10 @@
       <w:pPr>
         <w:pStyle w:val="Heading3"/>
       </w:pPr>
-      <w:bookmarkStart w:id="36" w:name="Xf0fe3734256e5255c5c6ead4fa2033e11d2c4fd"/>
-      <w:bookmarkStart w:id="37" w:name="Xde3d1acbf1f0719959acfcbca78a05c2a57a9aa"/>
-      <w:bookmarkEnd w:id="36"/>
-      <w:bookmarkEnd w:id="37"/>
+      <w:bookmarkStart w:id="45" w:name="Xf0fe3734256e5255c5c6ead4fa2033e11d2c4fd"/>
+      <w:bookmarkStart w:id="46" w:name="Xde3d1acbf1f0719959acfcbca78a05c2a57a9aa"/>
+      <w:bookmarkEnd w:id="45"/>
+      <w:bookmarkEnd w:id="46"/>
       <w:r>
         <w:t>Phase 3: Sequence processing and demultiplexing • TIMING 30 min - 4 h</w:t>
       </w:r>
@@ -11479,8 +11430,8 @@
       <w:pPr>
         <w:pStyle w:val="Heading4"/>
       </w:pPr>
-      <w:bookmarkStart w:id="38" w:name="X13cc74061b59b93ec4c85183ed4241367574747"/>
-      <w:bookmarkEnd w:id="38"/>
+      <w:bookmarkStart w:id="47" w:name="X13cc74061b59b93ec4c85183ed4241367574747"/>
+      <w:bookmarkEnd w:id="47"/>
       <w:r>
         <w:t>Step 8 | Prepare and execute sequence demultiplexing</w:t>
       </w:r>
@@ -11739,8 +11690,8 @@
       <w:pPr>
         <w:pStyle w:val="Heading4"/>
       </w:pPr>
-      <w:bookmarkStart w:id="39" w:name="X3e8311baebbb2296bbbbbfefd5b61514f194207"/>
-      <w:bookmarkEnd w:id="39"/>
+      <w:bookmarkStart w:id="48" w:name="X3e8311baebbb2296bbbbbfefd5b61514f194207"/>
+      <w:bookmarkEnd w:id="48"/>
       <w:r>
         <w:t>Step 9 | Process demultiplexing results and generate count tables</w:t>
       </w:r>
@@ -12036,8 +11987,8 @@
       <w:pPr>
         <w:pStyle w:val="Heading4"/>
       </w:pPr>
-      <w:bookmarkStart w:id="40" w:name="X36632f9da45bb9042e270f01a5fbba5c7d6b4eb"/>
-      <w:bookmarkEnd w:id="40"/>
+      <w:bookmarkStart w:id="49" w:name="X36632f9da45bb9042e270f01a5fbba5c7d6b4eb"/>
+      <w:bookmarkEnd w:id="49"/>
       <w:r>
         <w:t>Step 10 | Generate quality control reports</w:t>
       </w:r>
@@ -12181,7 +12132,7 @@
                     </pic:cNvPicPr>
                   </pic:nvPicPr>
                   <pic:blipFill>
-                    <a:blip r:embed="rId9"/>
+                    <a:blip r:embed="rId11"/>
                     <a:stretch>
                       <a:fillRect/>
                     </a:stretch>
@@ -12244,7 +12195,7 @@
                     </pic:cNvPicPr>
                   </pic:nvPicPr>
                   <pic:blipFill>
-                    <a:blip r:embed="rId10"/>
+                    <a:blip r:embed="rId12"/>
                     <a:stretch>
                       <a:fillRect/>
                     </a:stretch>
@@ -12286,7 +12237,7 @@
                     </pic:cNvPicPr>
                   </pic:nvPicPr>
                   <pic:blipFill>
-                    <a:blip r:embed="rId11"/>
+                    <a:blip r:embed="rId13"/>
                     <a:stretch>
                       <a:fillRect/>
                     </a:stretch>
@@ -12425,6 +12376,8 @@
         <w:t>Poor sequencing quality</w:t>
       </w:r>
     </w:p>
+    <w:bookmarkStart w:id="50" w:name="X8f960a0f3e79567cb4b1a5376daa0e80c93e760"/>
+    <w:bookmarkStart w:id="51" w:name="Xe2f7b09b19c9d1fad71d42d666bab706efc7c19"/>
     <w:p>
       <w:pPr>
         <w:pStyle w:val="Compact"/>
@@ -12433,8 +12386,6 @@
           <w:numId w:val="101"/>
         </w:numPr>
       </w:pPr>
-      <w:bookmarkStart w:id="41" w:name="X8f960a0f3e79567cb4b1a5376daa0e80c93e760"/>
-      <w:bookmarkStart w:id="42" w:name="Xe2f7b09b19c9d1fad71d42d666bab706efc7c19"/>
       <w:r>
         <w:rPr>
           <w:noProof/>
@@ -12506,8 +12457,8 @@
           </mc:Fallback>
         </mc:AlternateContent>
       </w:r>
-      <w:bookmarkEnd w:id="41"/>
-      <w:bookmarkEnd w:id="42"/>
+      <w:bookmarkEnd w:id="50"/>
+      <w:bookmarkEnd w:id="51"/>
       <w:r>
         <w:t>Poor library quality</w:t>
       </w:r>
@@ -12516,7 +12467,7 @@
       <w:pPr>
         <w:pStyle w:val="Heading3"/>
       </w:pPr>
-      <w:bookmarkStart w:id="43" w:name="Xaba9d93cb06973190dddb25ca1cb11e550141b1"/>
+      <w:bookmarkStart w:id="52" w:name="Xaba9d93cb06973190dddb25ca1cb11e550141b1"/>
       <w:r>
         <w:t>Phase 4: Data visualization and interpretation • TIMING 15-60 min</w:t>
       </w:r>
@@ -12625,7 +12576,7 @@
         </w:rPr>
         <w:t xml:space="preserve"># Dash is running on </w:t>
       </w:r>
-      <w:hyperlink r:id="rId12">
+      <w:hyperlink r:id="rId14">
         <w:r>
           <w:rPr>
             <w:highlight w:val="black"/>
@@ -12691,7 +12642,7 @@
       <w:r>
         <w:t xml:space="preserve">This command starts a server interface that can be opened from a web browser (typically at </w:t>
       </w:r>
-      <w:hyperlink r:id="rId13">
+      <w:hyperlink r:id="rId15">
         <w:r>
           <w:t>http://localhost:8050</w:t>
         </w:r>
@@ -12811,7 +12762,7 @@
                     </pic:cNvPicPr>
                   </pic:nvPicPr>
                   <pic:blipFill>
-                    <a:blip r:embed="rId14"/>
+                    <a:blip r:embed="rId16"/>
                     <a:stretch>
                       <a:fillRect/>
                     </a:stretch>
@@ -14246,7 +14197,7 @@
                     </pic:cNvPicPr>
                   </pic:nvPicPr>
                   <pic:blipFill>
-                    <a:blip r:embed="rId15"/>
+                    <a:blip r:embed="rId17"/>
                     <a:stretch>
                       <a:fillRect/>
                     </a:stretch>
@@ -15582,11 +15533,11 @@
         <w:pStyle w:val="Heading2"/>
         <w:spacing w:before="0"/>
       </w:pPr>
-      <w:bookmarkStart w:id="44" w:name="procedure"/>
-      <w:bookmarkStart w:id="45" w:name="Xb82b66e291742b89762042c80cc9d287015abca"/>
-      <w:bookmarkEnd w:id="43"/>
-      <w:bookmarkEnd w:id="44"/>
-      <w:bookmarkEnd w:id="45"/>
+      <w:bookmarkStart w:id="53" w:name="procedure"/>
+      <w:bookmarkStart w:id="54" w:name="Xb82b66e291742b89762042c80cc9d287015abca"/>
+      <w:bookmarkEnd w:id="52"/>
+      <w:bookmarkEnd w:id="53"/>
+      <w:bookmarkEnd w:id="54"/>
       <w:r>
         <w:lastRenderedPageBreak/>
         <w:t>Troubleshooting</w:t>
@@ -16616,8 +16567,8 @@
       <w:pPr>
         <w:pStyle w:val="Heading2"/>
       </w:pPr>
-      <w:bookmarkStart w:id="46" w:name="quality-control-thresholds"/>
-      <w:bookmarkEnd w:id="46"/>
+      <w:bookmarkStart w:id="55" w:name="quality-control-thresholds"/>
+      <w:bookmarkEnd w:id="55"/>
       <w:r>
         <w:t>Timing</w:t>
       </w:r>
@@ -17367,9 +17318,9 @@
       <w:pPr>
         <w:pStyle w:val="Heading2"/>
       </w:pPr>
-      <w:bookmarkStart w:id="47" w:name="timing"/>
-      <w:bookmarkStart w:id="48" w:name="anticipated-results"/>
-      <w:bookmarkEnd w:id="47"/>
+      <w:bookmarkStart w:id="56" w:name="timing"/>
+      <w:bookmarkStart w:id="57" w:name="anticipated-results"/>
+      <w:bookmarkEnd w:id="56"/>
       <w:r>
         <w:t>Anticipated results</w:t>
       </w:r>
@@ -17399,8 +17350,8 @@
           <w:szCs w:val="16"/>
         </w:rPr>
       </w:pPr>
-      <w:bookmarkStart w:id="49" w:name="output-file-structure"/>
-      <w:bookmarkEnd w:id="49"/>
+      <w:bookmarkStart w:id="58" w:name="output-file-structure"/>
+      <w:bookmarkEnd w:id="58"/>
       <w:proofErr w:type="spellStart"/>
       <w:r>
         <w:rPr>
@@ -19410,8 +19361,8 @@
       <w:pPr>
         <w:pStyle w:val="Heading3"/>
       </w:pPr>
-      <w:bookmarkStart w:id="50" w:name="chemical-library-characterization"/>
-      <w:bookmarkEnd w:id="50"/>
+      <w:bookmarkStart w:id="59" w:name="chemical-library-characterization"/>
+      <w:bookmarkEnd w:id="59"/>
       <w:r>
         <w:t>Demultiplexing performance</w:t>
       </w:r>
@@ -19623,8 +19574,8 @@
       <w:pPr>
         <w:pStyle w:val="Heading3"/>
       </w:pPr>
-      <w:bookmarkStart w:id="51" w:name="sequence-processing-performance"/>
-      <w:bookmarkEnd w:id="51"/>
+      <w:bookmarkStart w:id="60" w:name="sequence-processing-performance"/>
+      <w:bookmarkEnd w:id="60"/>
       <w:r>
         <w:lastRenderedPageBreak/>
         <w:t>Statistical analysis outputs</w:t>
@@ -19767,9 +19718,9 @@
       <w:pPr>
         <w:pStyle w:val="Heading3"/>
       </w:pPr>
-      <w:bookmarkStart w:id="52" w:name="statistical-analysis-outputs"/>
-      <w:bookmarkStart w:id="53" w:name="X2adae44e66c443bd6c439e1b5f936dcc17bc46e"/>
-      <w:bookmarkEnd w:id="52"/>
+      <w:bookmarkStart w:id="61" w:name="statistical-analysis-outputs"/>
+      <w:bookmarkStart w:id="62" w:name="X2adae44e66c443bd6c439e1b5f936dcc17bc46e"/>
+      <w:bookmarkEnd w:id="61"/>
       <w:r>
         <w:t>Integration capabilities and downstream applications</w:t>
       </w:r>
@@ -20019,8 +19970,8 @@
       <w:r>
         <w:t>: Compare enrichment patterns across different protein targets</w:t>
       </w:r>
-      <w:bookmarkEnd w:id="48"/>
-      <w:bookmarkEnd w:id="53"/>
+      <w:bookmarkEnd w:id="57"/>
+      <w:bookmarkEnd w:id="62"/>
     </w:p>
     <w:p>
       <w:pPr>
@@ -20069,7 +20020,7 @@
       <w:r>
         <w:t xml:space="preserve">: </w:t>
       </w:r>
-      <w:hyperlink r:id="rId16">
+      <w:hyperlink r:id="rId18">
         <w:r>
           <w:t>https://github.com/DELTechnology/delt-hit</w:t>
         </w:r>
@@ -20234,10 +20185,10 @@
       <w:pPr>
         <w:pStyle w:val="Heading2"/>
       </w:pPr>
-      <w:bookmarkStart w:id="54" w:name="data-and-code-availability"/>
-      <w:bookmarkStart w:id="55" w:name="software-access-and-documentation"/>
-      <w:bookmarkEnd w:id="54"/>
-      <w:bookmarkEnd w:id="55"/>
+      <w:bookmarkStart w:id="63" w:name="data-and-code-availability"/>
+      <w:bookmarkStart w:id="64" w:name="software-access-and-documentation"/>
+      <w:bookmarkEnd w:id="63"/>
+      <w:bookmarkEnd w:id="64"/>
       <w:r>
         <w:t>Author contributions</w:t>
       </w:r>
@@ -20254,8 +20205,8 @@
       <w:pPr>
         <w:pStyle w:val="Heading2"/>
       </w:pPr>
-      <w:bookmarkStart w:id="56" w:name="author-contributions"/>
-      <w:bookmarkEnd w:id="56"/>
+      <w:bookmarkStart w:id="65" w:name="author-contributions"/>
+      <w:bookmarkEnd w:id="65"/>
       <w:r>
         <w:t>Competing interests</w:t>
       </w:r>
@@ -20272,8 +20223,8 @@
       <w:pPr>
         <w:pStyle w:val="Heading2"/>
       </w:pPr>
-      <w:bookmarkStart w:id="57" w:name="competing-interests"/>
-      <w:bookmarkEnd w:id="57"/>
+      <w:bookmarkStart w:id="66" w:name="competing-interests"/>
+      <w:bookmarkEnd w:id="66"/>
       <w:r>
         <w:t>Acknowledgments</w:t>
       </w:r>
@@ -20319,9 +20270,9 @@
       <w:pPr>
         <w:pStyle w:val="Heading2"/>
       </w:pPr>
-      <w:bookmarkStart w:id="58" w:name="acknowledgments"/>
-      <w:bookmarkStart w:id="59" w:name="references"/>
-      <w:bookmarkEnd w:id="58"/>
+      <w:bookmarkStart w:id="67" w:name="acknowledgments"/>
+      <w:bookmarkStart w:id="68" w:name="references"/>
+      <w:bookmarkEnd w:id="67"/>
     </w:p>
     <w:p>
       <w:pPr>
@@ -20331,7 +20282,7 @@
         <w:t>References</w:t>
       </w:r>
       <w:bookmarkEnd w:id="0"/>
-      <w:bookmarkEnd w:id="59"/>
+      <w:bookmarkEnd w:id="68"/>
     </w:p>
     <w:p>
       <w:pPr>
@@ -20599,6 +20550,7 @@
         <w:ind w:left="720" w:hanging="720"/>
         <w:rPr>
           <w:noProof/>
+          <w:lang w:val="it-CH"/>
         </w:rPr>
       </w:pPr>
       <w:r>
@@ -20618,12 +20570,14 @@
         <w:rPr>
           <w:i/>
           <w:noProof/>
+          <w:lang w:val="it-CH"/>
         </w:rPr>
         <w:t>Chimia</w:t>
       </w:r>
       <w:r>
         <w:rPr>
           <w:noProof/>
+          <w:lang w:val="it-CH"/>
         </w:rPr>
         <w:t xml:space="preserve"> </w:t>
       </w:r>
@@ -20631,12 +20585,14 @@
         <w:rPr>
           <w:b/>
           <w:noProof/>
+          <w:lang w:val="it-CH"/>
         </w:rPr>
         <w:t>76</w:t>
       </w:r>
       <w:r>
         <w:rPr>
           <w:noProof/>
+          <w:lang w:val="it-CH"/>
         </w:rPr>
         <w:t>, 388–395, doi:10.2533/chimia.2022.388 (2022).</w:t>
       </w:r>
@@ -20653,12 +20609,14 @@
       <w:r>
         <w:rPr>
           <w:noProof/>
+          <w:lang w:val="it-CH"/>
         </w:rPr>
         <w:t>7.</w:t>
       </w:r>
       <w:r>
         <w:rPr>
           <w:noProof/>
+          <w:lang w:val="it-CH"/>
         </w:rPr>
         <w:tab/>
         <w:t>Satz, A. L.</w:t>
@@ -20667,12 +20625,14 @@
         <w:rPr>
           <w:i/>
           <w:noProof/>
+          <w:lang w:val="it-CH"/>
         </w:rPr>
         <w:t xml:space="preserve"> et al.</w:t>
       </w:r>
       <w:r>
         <w:rPr>
           <w:noProof/>
+          <w:lang w:val="it-CH"/>
         </w:rPr>
         <w:t xml:space="preserve"> DNA-encoded chemical libraries. </w:t>
       </w:r>
@@ -20968,6 +20928,7 @@
         <w:ind w:left="720" w:hanging="720"/>
         <w:rPr>
           <w:noProof/>
+          <w:lang w:val="fr-CH"/>
         </w:rPr>
       </w:pPr>
       <w:r>
@@ -20987,12 +20948,14 @@
         <w:rPr>
           <w:i/>
           <w:noProof/>
+          <w:lang w:val="fr-CH"/>
         </w:rPr>
         <w:t>Trends in Pharmacological Sciences</w:t>
       </w:r>
       <w:r>
         <w:rPr>
           <w:noProof/>
+          <w:lang w:val="fr-CH"/>
         </w:rPr>
         <w:t xml:space="preserve"> </w:t>
       </w:r>
@@ -21000,12 +20963,14 @@
         <w:rPr>
           <w:b/>
           <w:noProof/>
+          <w:lang w:val="fr-CH"/>
         </w:rPr>
         <w:t>44</w:t>
       </w:r>
       <w:r>
         <w:rPr>
           <w:noProof/>
+          <w:lang w:val="fr-CH"/>
         </w:rPr>
         <w:t>, 817–831, doi:10.1016/j.tips.2023.08.006 (2023).</w:t>
       </w:r>
@@ -21022,12 +20987,14 @@
       <w:r>
         <w:rPr>
           <w:noProof/>
+          <w:lang w:val="fr-CH"/>
         </w:rPr>
         <w:t>14.</w:t>
       </w:r>
       <w:r>
         <w:rPr>
           <w:noProof/>
+          <w:lang w:val="fr-CH"/>
         </w:rPr>
         <w:tab/>
         <w:t>Plais, L.</w:t>
@@ -21036,14 +21003,22 @@
         <w:rPr>
           <w:i/>
           <w:noProof/>
+          <w:lang w:val="fr-CH"/>
         </w:rPr>
         <w:t xml:space="preserve"> et al.</w:t>
       </w:r>
       <w:r>
         <w:rPr>
           <w:noProof/>
-        </w:rPr>
-        <w:t xml:space="preserve"> Universal encoding of next generation DNA-encoded chemical libraries. </w:t>
+          <w:lang w:val="fr-CH"/>
+        </w:rPr>
+        <w:t xml:space="preserve"> </w:t>
+      </w:r>
+      <w:r>
+        <w:rPr>
+          <w:noProof/>
+        </w:rPr>
+        <w:t xml:space="preserve">Universal encoding of next generation DNA-encoded chemical libraries. </w:t>
       </w:r>
       <w:r>
         <w:rPr>
@@ -21436,6 +21411,7 @@
         <w:ind w:left="720" w:hanging="720"/>
         <w:rPr>
           <w:noProof/>
+          <w:lang w:val="fr-CH"/>
         </w:rPr>
       </w:pPr>
       <w:r>
@@ -21468,12 +21444,14 @@
         <w:rPr>
           <w:i/>
           <w:noProof/>
+          <w:lang w:val="fr-CH"/>
         </w:rPr>
         <w:t>Nature Communications</w:t>
       </w:r>
       <w:r>
         <w:rPr>
           <w:noProof/>
+          <w:lang w:val="fr-CH"/>
         </w:rPr>
         <w:t xml:space="preserve"> </w:t>
       </w:r>
@@ -21481,12 +21459,14 @@
         <w:rPr>
           <w:b/>
           <w:noProof/>
+          <w:lang w:val="fr-CH"/>
         </w:rPr>
         <w:t>15</w:t>
       </w:r>
       <w:r>
         <w:rPr>
           <w:noProof/>
+          <w:lang w:val="fr-CH"/>
         </w:rPr>
         <w:t>, 5640, doi:10.1038/s41467-024-49777-x (2024).</w:t>
       </w:r>
@@ -21503,12 +21483,14 @@
       <w:r>
         <w:rPr>
           <w:noProof/>
+          <w:lang w:val="fr-CH"/>
         </w:rPr>
         <w:t>23.</w:t>
       </w:r>
       <w:r>
         <w:rPr>
           <w:noProof/>
+          <w:lang w:val="fr-CH"/>
         </w:rPr>
         <w:tab/>
         <w:t>Edwards, A. M.</w:t>
@@ -21517,14 +21499,22 @@
         <w:rPr>
           <w:i/>
           <w:noProof/>
+          <w:lang w:val="fr-CH"/>
         </w:rPr>
         <w:t xml:space="preserve"> et al.</w:t>
       </w:r>
       <w:r>
         <w:rPr>
           <w:noProof/>
-        </w:rPr>
-        <w:t xml:space="preserve"> Protein–ligand data at scale to support machine learning. </w:t>
+          <w:lang w:val="fr-CH"/>
+        </w:rPr>
+        <w:t xml:space="preserve"> </w:t>
+      </w:r>
+      <w:r>
+        <w:rPr>
+          <w:noProof/>
+        </w:rPr>
+        <w:t xml:space="preserve">Protein–ligand data at scale to support machine learning. </w:t>
       </w:r>
       <w:r>
         <w:rPr>
@@ -21748,7 +21738,7 @@
         </w:rPr>
         <w:t>, e202511839, doi:</w:t>
       </w:r>
-      <w:hyperlink r:id="rId17" w:history="1">
+      <w:hyperlink r:id="rId19" w:history="1">
         <w:r>
           <w:rPr>
             <w:rStyle w:val="Hyperlink"/>
@@ -21898,15 +21888,23 @@
       <w:r>
         <w:rPr>
           <w:noProof/>
+          <w:lang w:val="de-CH"/>
         </w:rPr>
         <w:t>31.</w:t>
       </w:r>
       <w:r>
         <w:rPr>
           <w:noProof/>
+          <w:lang w:val="de-CH"/>
         </w:rPr>
         <w:tab/>
-        <w:t xml:space="preserve">Weininger, D., Weininger, A. &amp; Weininger, J. L. SMILES. 2. Algorithm for generation of unique SMILES notation. </w:t>
+        <w:t xml:space="preserve">Weininger, D., Weininger, A. &amp; Weininger, J. L. SMILES. </w:t>
+      </w:r>
+      <w:r>
+        <w:rPr>
+          <w:noProof/>
+        </w:rPr>
+        <w:t xml:space="preserve">2. Algorithm for generation of unique SMILES notation. </w:t>
       </w:r>
       <w:r>
         <w:rPr>
@@ -22031,7 +22029,7 @@
         </w:rPr>
         <w:t xml:space="preserve"> </w:t>
       </w:r>
-      <w:hyperlink r:id="rId18" w:history="1">
+      <w:hyperlink r:id="rId20" w:history="1">
         <w:r>
           <w:rPr>
             <w:rStyle w:val="Hyperlink"/>
@@ -22087,7 +22085,7 @@
         </w:rPr>
         <w:t xml:space="preserve"> </w:t>
       </w:r>
-      <w:hyperlink r:id="rId19" w:history="1">
+      <w:hyperlink r:id="rId21" w:history="1">
         <w:r>
           <w:rPr>
             <w:rStyle w:val="Hyperlink"/>
@@ -22104,17 +22102,20 @@
         <w:ind w:left="720" w:hanging="720"/>
         <w:rPr>
           <w:noProof/>
-        </w:rPr>
-      </w:pPr>
-      <w:r>
-        <w:rPr>
-          <w:noProof/>
+          <w:lang w:val="fr-CH"/>
+        </w:rPr>
+      </w:pPr>
+      <w:r>
+        <w:rPr>
+          <w:noProof/>
+          <w:lang w:val="fr-CH"/>
         </w:rPr>
         <w:t>35.</w:t>
       </w:r>
       <w:r>
         <w:rPr>
           <w:noProof/>
+          <w:lang w:val="fr-CH"/>
         </w:rPr>
         <w:tab/>
         <w:t xml:space="preserve">Landrum, G. </w:t>
@@ -22123,18 +22124,21 @@
         <w:rPr>
           <w:i/>
           <w:noProof/>
+          <w:lang w:val="fr-CH"/>
         </w:rPr>
         <w:t>et al.</w:t>
       </w:r>
       <w:r>
         <w:rPr>
           <w:noProof/>
+          <w:lang w:val="fr-CH"/>
         </w:rPr>
         <w:t xml:space="preserve"> RDKit: Open-source cheminformatics</w:t>
       </w:r>
       <w:r>
         <w:rPr>
           <w:noProof/>
+          <w:lang w:val="fr-CH"/>
         </w:rPr>
         <w:t xml:space="preserve">, </w:t>
       </w:r>
@@ -22151,8 +22155,14 @@
       <w:r>
         <w:rPr>
           <w:noProof/>
+          <w:lang w:val="fr-CH"/>
         </w:rPr>
         <w:tab/>
+      </w:r>
+      <w:r>
+        <w:rPr>
+          <w:noProof/>
+        </w:rPr>
         <w:t>doi:</w:t>
       </w:r>
       <w:r>
@@ -22525,6 +22535,12 @@
       </w:r>
     </w:p>
     <w:sectPr>
+      <w:headerReference w:type="even" r:id="rId22"/>
+      <w:headerReference w:type="default" r:id="rId23"/>
+      <w:footerReference w:type="even" r:id="rId24"/>
+      <w:footerReference w:type="default" r:id="rId25"/>
+      <w:headerReference w:type="first" r:id="rId26"/>
+      <w:footerReference w:type="first" r:id="rId27"/>
       <w:pgSz w:w="12240" w:h="15840"/>
       <w:pgMar w:top="1440" w:right="1440" w:bottom="1440" w:left="1440" w:header="0" w:footer="0" w:gutter="0"/>
       <w:cols w:space="720"/>
@@ -22533,6 +22549,116 @@
     </w:sectPr>
   </w:body>
 </w:document>
+</file>
+
+<file path=word/endnotes.xml><?xml version="1.0" encoding="utf-8"?>
+<w:endnotes xmlns:wpc="http://schemas.microsoft.com/office/word/2010/wordprocessingCanvas" xmlns:cx="http://schemas.microsoft.com/office/drawing/2014/chartex" xmlns:cx1="http://schemas.microsoft.com/office/drawing/2015/9/8/chartex" xmlns:cx2="http://schemas.microsoft.com/office/drawing/2015/10/21/chartex" xmlns:cx3="http://schemas.microsoft.com/office/drawing/2016/5/9/chartex" xmlns:cx4="http://schemas.microsoft.com/office/drawing/2016/5/10/chartex" xmlns:cx5="http://schemas.microsoft.com/office/drawing/2016/5/11/chartex" xmlns:cx6="http://schemas.microsoft.com/office/drawing/2016/5/12/chartex" xmlns:cx7="http://schemas.microsoft.com/office/drawing/2016/5/13/chartex" xmlns:cx8="http://schemas.microsoft.com/office/drawing/2016/5/14/chartex" xmlns:mc="http://schemas.openxmlformats.org/markup-compatibility/2006" xmlns:aink="http://schemas.microsoft.com/office/drawing/2016/ink" xmlns:am3d="http://schemas.microsoft.com/office/drawing/2017/model3d" xmlns:o="urn:schemas-microsoft-com:office:office" xmlns:oel="http://schemas.microsoft.com/office/2019/extlst" xmlns:r="http://schemas.openxmlformats.org/officeDocument/2006/relationships" xmlns:m="http://schemas.openxmlformats.org/officeDocument/2006/math" xmlns:v="urn:schemas-microsoft-com:vml" xmlns:wp14="http://schemas.microsoft.com/office/word/2010/wordprocessingDrawing" xmlns:wp="http://schemas.openxmlformats.org/drawingml/2006/wordprocessingDrawing" xmlns:w10="urn:schemas-microsoft-com:office:word" xmlns:w="http://schemas.openxmlformats.org/wordprocessingml/2006/main" xmlns:w14="http://schemas.microsoft.com/office/word/2010/wordml" xmlns:w15="http://schemas.microsoft.com/office/word/2012/wordml" xmlns:w16cex="http://schemas.microsoft.com/office/word/2018/wordml/cex" xmlns:w16cid="http://schemas.microsoft.com/office/word/2016/wordml/cid" xmlns:w16="http://schemas.microsoft.com/office/word/2018/wordml" xmlns:w16du="http://schemas.microsoft.com/office/word/2023/wordml/word16du" xmlns:w16sdtdh="http://schemas.microsoft.com/office/word/2020/wordml/sdtdatahash" xmlns:w16sdtfl="http://schemas.microsoft.com/office/word/2024/wordml/sdtformatlock" xmlns:w16se="http://schemas.microsoft.com/office/word/2015/wordml/symex" xmlns:wpg="http://schemas.microsoft.com/office/word/2010/wordprocessingGroup" xmlns:wpi="http://schemas.microsoft.com/office/word/2010/wordprocessingInk" xmlns:wne="http://schemas.microsoft.com/office/word/2006/wordml" xmlns:wps="http://schemas.microsoft.com/office/word/2010/wordprocessingShape" mc:Ignorable="w14 w15 w16se w16cid w16 w16cex w16sdtdh w16sdtfl w16du wp14">
+  <w:endnote w:type="separator" w:id="-1">
+    <w:p>
+      <w:pPr>
+        <w:spacing w:before="0" w:after="0"/>
+      </w:pPr>
+      <w:r>
+        <w:separator/>
+      </w:r>
+    </w:p>
+  </w:endnote>
+  <w:endnote w:type="continuationSeparator" w:id="0">
+    <w:p>
+      <w:pPr>
+        <w:spacing w:before="0" w:after="0"/>
+      </w:pPr>
+      <w:r>
+        <w:continuationSeparator/>
+      </w:r>
+    </w:p>
+  </w:endnote>
+</w:endnotes>
+</file>
+
+<file path=word/footer1.xml><?xml version="1.0" encoding="utf-8"?>
+<w:ftr xmlns:wpc="http://schemas.microsoft.com/office/word/2010/wordprocessingCanvas" xmlns:cx="http://schemas.microsoft.com/office/drawing/2014/chartex" xmlns:cx1="http://schemas.microsoft.com/office/drawing/2015/9/8/chartex" xmlns:cx2="http://schemas.microsoft.com/office/drawing/2015/10/21/chartex" xmlns:cx3="http://schemas.microsoft.com/office/drawing/2016/5/9/chartex" xmlns:cx4="http://schemas.microsoft.com/office/drawing/2016/5/10/chartex" xmlns:cx5="http://schemas.microsoft.com/office/drawing/2016/5/11/chartex" xmlns:cx6="http://schemas.microsoft.com/office/drawing/2016/5/12/chartex" xmlns:cx7="http://schemas.microsoft.com/office/drawing/2016/5/13/chartex" xmlns:cx8="http://schemas.microsoft.com/office/drawing/2016/5/14/chartex" xmlns:mc="http://schemas.openxmlformats.org/markup-compatibility/2006" xmlns:aink="http://schemas.microsoft.com/office/drawing/2016/ink" xmlns:am3d="http://schemas.microsoft.com/office/drawing/2017/model3d" xmlns:o="urn:schemas-microsoft-com:office:office" xmlns:oel="http://schemas.microsoft.com/office/2019/extlst" xmlns:r="http://schemas.openxmlformats.org/officeDocument/2006/relationships" xmlns:m="http://schemas.openxmlformats.org/officeDocument/2006/math" xmlns:v="urn:schemas-microsoft-com:vml" xmlns:wp14="http://schemas.microsoft.com/office/word/2010/wordprocessingDrawing" xmlns:wp="http://schemas.openxmlformats.org/drawingml/2006/wordprocessingDrawing" xmlns:w10="urn:schemas-microsoft-com:office:word" xmlns:w="http://schemas.openxmlformats.org/wordprocessingml/2006/main" xmlns:w14="http://schemas.microsoft.com/office/word/2010/wordml" xmlns:w15="http://schemas.microsoft.com/office/word/2012/wordml" xmlns:w16cex="http://schemas.microsoft.com/office/word/2018/wordml/cex" xmlns:w16cid="http://schemas.microsoft.com/office/word/2016/wordml/cid" xmlns:w16="http://schemas.microsoft.com/office/word/2018/wordml" xmlns:w16du="http://schemas.microsoft.com/office/word/2023/wordml/word16du" xmlns:w16sdtdh="http://schemas.microsoft.com/office/word/2020/wordml/sdtdatahash" xmlns:w16sdtfl="http://schemas.microsoft.com/office/word/2024/wordml/sdtformatlock" xmlns:w16se="http://schemas.microsoft.com/office/word/2015/wordml/symex" xmlns:wpg="http://schemas.microsoft.com/office/word/2010/wordprocessingGroup" xmlns:wpi="http://schemas.microsoft.com/office/word/2010/wordprocessingInk" xmlns:wne="http://schemas.microsoft.com/office/word/2006/wordml" xmlns:wps="http://schemas.microsoft.com/office/word/2010/wordprocessingShape" mc:Ignorable="w14 w15 w16se w16cid w16 w16cex w16sdtdh w16sdtfl w16du wp14">
+  <w:p>
+    <w:pPr>
+      <w:pStyle w:val="Footer"/>
+    </w:pPr>
+  </w:p>
+</w:ftr>
+</file>
+
+<file path=word/footer2.xml><?xml version="1.0" encoding="utf-8"?>
+<w:ftr xmlns:wpc="http://schemas.microsoft.com/office/word/2010/wordprocessingCanvas" xmlns:cx="http://schemas.microsoft.com/office/drawing/2014/chartex" xmlns:cx1="http://schemas.microsoft.com/office/drawing/2015/9/8/chartex" xmlns:cx2="http://schemas.microsoft.com/office/drawing/2015/10/21/chartex" xmlns:cx3="http://schemas.microsoft.com/office/drawing/2016/5/9/chartex" xmlns:cx4="http://schemas.microsoft.com/office/drawing/2016/5/10/chartex" xmlns:cx5="http://schemas.microsoft.com/office/drawing/2016/5/11/chartex" xmlns:cx6="http://schemas.microsoft.com/office/drawing/2016/5/12/chartex" xmlns:cx7="http://schemas.microsoft.com/office/drawing/2016/5/13/chartex" xmlns:cx8="http://schemas.microsoft.com/office/drawing/2016/5/14/chartex" xmlns:mc="http://schemas.openxmlformats.org/markup-compatibility/2006" xmlns:aink="http://schemas.microsoft.com/office/drawing/2016/ink" xmlns:am3d="http://schemas.microsoft.com/office/drawing/2017/model3d" xmlns:o="urn:schemas-microsoft-com:office:office" xmlns:oel="http://schemas.microsoft.com/office/2019/extlst" xmlns:r="http://schemas.openxmlformats.org/officeDocument/2006/relationships" xmlns:m="http://schemas.openxmlformats.org/officeDocument/2006/math" xmlns:v="urn:schemas-microsoft-com:vml" xmlns:wp14="http://schemas.microsoft.com/office/word/2010/wordprocessingDrawing" xmlns:wp="http://schemas.openxmlformats.org/drawingml/2006/wordprocessingDrawing" xmlns:w10="urn:schemas-microsoft-com:office:word" xmlns:w="http://schemas.openxmlformats.org/wordprocessingml/2006/main" xmlns:w14="http://schemas.microsoft.com/office/word/2010/wordml" xmlns:w15="http://schemas.microsoft.com/office/word/2012/wordml" xmlns:w16cex="http://schemas.microsoft.com/office/word/2018/wordml/cex" xmlns:w16cid="http://schemas.microsoft.com/office/word/2016/wordml/cid" xmlns:w16="http://schemas.microsoft.com/office/word/2018/wordml" xmlns:w16du="http://schemas.microsoft.com/office/word/2023/wordml/word16du" xmlns:w16sdtdh="http://schemas.microsoft.com/office/word/2020/wordml/sdtdatahash" xmlns:w16sdtfl="http://schemas.microsoft.com/office/word/2024/wordml/sdtformatlock" xmlns:w16se="http://schemas.microsoft.com/office/word/2015/wordml/symex" xmlns:wpg="http://schemas.microsoft.com/office/word/2010/wordprocessingGroup" xmlns:wpi="http://schemas.microsoft.com/office/word/2010/wordprocessingInk" xmlns:wne="http://schemas.microsoft.com/office/word/2006/wordml" xmlns:wps="http://schemas.microsoft.com/office/word/2010/wordprocessingShape" mc:Ignorable="w14 w15 w16se w16cid w16 w16cex w16sdtdh w16sdtfl w16du wp14">
+  <w:p>
+    <w:pPr>
+      <w:pStyle w:val="Footer"/>
+    </w:pPr>
+  </w:p>
+</w:ftr>
+</file>
+
+<file path=word/footer3.xml><?xml version="1.0" encoding="utf-8"?>
+<w:ftr xmlns:wpc="http://schemas.microsoft.com/office/word/2010/wordprocessingCanvas" xmlns:cx="http://schemas.microsoft.com/office/drawing/2014/chartex" xmlns:cx1="http://schemas.microsoft.com/office/drawing/2015/9/8/chartex" xmlns:cx2="http://schemas.microsoft.com/office/drawing/2015/10/21/chartex" xmlns:cx3="http://schemas.microsoft.com/office/drawing/2016/5/9/chartex" xmlns:cx4="http://schemas.microsoft.com/office/drawing/2016/5/10/chartex" xmlns:cx5="http://schemas.microsoft.com/office/drawing/2016/5/11/chartex" xmlns:cx6="http://schemas.microsoft.com/office/drawing/2016/5/12/chartex" xmlns:cx7="http://schemas.microsoft.com/office/drawing/2016/5/13/chartex" xmlns:cx8="http://schemas.microsoft.com/office/drawing/2016/5/14/chartex" xmlns:mc="http://schemas.openxmlformats.org/markup-compatibility/2006" xmlns:aink="http://schemas.microsoft.com/office/drawing/2016/ink" xmlns:am3d="http://schemas.microsoft.com/office/drawing/2017/model3d" xmlns:o="urn:schemas-microsoft-com:office:office" xmlns:oel="http://schemas.microsoft.com/office/2019/extlst" xmlns:r="http://schemas.openxmlformats.org/officeDocument/2006/relationships" xmlns:m="http://schemas.openxmlformats.org/officeDocument/2006/math" xmlns:v="urn:schemas-microsoft-com:vml" xmlns:wp14="http://schemas.microsoft.com/office/word/2010/wordprocessingDrawing" xmlns:wp="http://schemas.openxmlformats.org/drawingml/2006/wordprocessingDrawing" xmlns:w10="urn:schemas-microsoft-com:office:word" xmlns:w="http://schemas.openxmlformats.org/wordprocessingml/2006/main" xmlns:w14="http://schemas.microsoft.com/office/word/2010/wordml" xmlns:w15="http://schemas.microsoft.com/office/word/2012/wordml" xmlns:w16cex="http://schemas.microsoft.com/office/word/2018/wordml/cex" xmlns:w16cid="http://schemas.microsoft.com/office/word/2016/wordml/cid" xmlns:w16="http://schemas.microsoft.com/office/word/2018/wordml" xmlns:w16du="http://schemas.microsoft.com/office/word/2023/wordml/word16du" xmlns:w16sdtdh="http://schemas.microsoft.com/office/word/2020/wordml/sdtdatahash" xmlns:w16sdtfl="http://schemas.microsoft.com/office/word/2024/wordml/sdtformatlock" xmlns:w16se="http://schemas.microsoft.com/office/word/2015/wordml/symex" xmlns:wpg="http://schemas.microsoft.com/office/word/2010/wordprocessingGroup" xmlns:wpi="http://schemas.microsoft.com/office/word/2010/wordprocessingInk" xmlns:wne="http://schemas.microsoft.com/office/word/2006/wordml" xmlns:wps="http://schemas.microsoft.com/office/word/2010/wordprocessingShape" mc:Ignorable="w14 w15 w16se w16cid w16 w16cex w16sdtdh w16sdtfl w16du wp14">
+  <w:p>
+    <w:pPr>
+      <w:pStyle w:val="Footer"/>
+    </w:pPr>
+  </w:p>
+</w:ftr>
+</file>
+
+<file path=word/footnotes.xml><?xml version="1.0" encoding="utf-8"?>
+<w:footnotes xmlns:wpc="http://schemas.microsoft.com/office/word/2010/wordprocessingCanvas" xmlns:cx="http://schemas.microsoft.com/office/drawing/2014/chartex" xmlns:cx1="http://schemas.microsoft.com/office/drawing/2015/9/8/chartex" xmlns:cx2="http://schemas.microsoft.com/office/drawing/2015/10/21/chartex" xmlns:cx3="http://schemas.microsoft.com/office/drawing/2016/5/9/chartex" xmlns:cx4="http://schemas.microsoft.com/office/drawing/2016/5/10/chartex" xmlns:cx5="http://schemas.microsoft.com/office/drawing/2016/5/11/chartex" xmlns:cx6="http://schemas.microsoft.com/office/drawing/2016/5/12/chartex" xmlns:cx7="http://schemas.microsoft.com/office/drawing/2016/5/13/chartex" xmlns:cx8="http://schemas.microsoft.com/office/drawing/2016/5/14/chartex" xmlns:mc="http://schemas.openxmlformats.org/markup-compatibility/2006" xmlns:aink="http://schemas.microsoft.com/office/drawing/2016/ink" xmlns:am3d="http://schemas.microsoft.com/office/drawing/2017/model3d" xmlns:o="urn:schemas-microsoft-com:office:office" xmlns:oel="http://schemas.microsoft.com/office/2019/extlst" xmlns:r="http://schemas.openxmlformats.org/officeDocument/2006/relationships" xmlns:m="http://schemas.openxmlformats.org/officeDocument/2006/math" xmlns:v="urn:schemas-microsoft-com:vml" xmlns:wp14="http://schemas.microsoft.com/office/word/2010/wordprocessingDrawing" xmlns:wp="http://schemas.openxmlformats.org/drawingml/2006/wordprocessingDrawing" xmlns:w10="urn:schemas-microsoft-com:office:word" xmlns:w="http://schemas.openxmlformats.org/wordprocessingml/2006/main" xmlns:w14="http://schemas.microsoft.com/office/word/2010/wordml" xmlns:w15="http://schemas.microsoft.com/office/word/2012/wordml" xmlns:w16cex="http://schemas.microsoft.com/office/word/2018/wordml/cex" xmlns:w16cid="http://schemas.microsoft.com/office/word/2016/wordml/cid" xmlns:w16="http://schemas.microsoft.com/office/word/2018/wordml" xmlns:w16du="http://schemas.microsoft.com/office/word/2023/wordml/word16du" xmlns:w16sdtdh="http://schemas.microsoft.com/office/word/2020/wordml/sdtdatahash" xmlns:w16sdtfl="http://schemas.microsoft.com/office/word/2024/wordml/sdtformatlock" xmlns:w16se="http://schemas.microsoft.com/office/word/2015/wordml/symex" xmlns:wpg="http://schemas.microsoft.com/office/word/2010/wordprocessingGroup" xmlns:wpi="http://schemas.microsoft.com/office/word/2010/wordprocessingInk" xmlns:wne="http://schemas.microsoft.com/office/word/2006/wordml" xmlns:wps="http://schemas.microsoft.com/office/word/2010/wordprocessingShape" mc:Ignorable="w14 w15 w16se w16cid w16 w16cex w16sdtdh w16sdtfl w16du wp14">
+  <w:footnote w:type="separator" w:id="-1">
+    <w:p>
+      <w:pPr>
+        <w:spacing w:before="0" w:after="0"/>
+      </w:pPr>
+      <w:r>
+        <w:separator/>
+      </w:r>
+    </w:p>
+  </w:footnote>
+  <w:footnote w:type="continuationSeparator" w:id="0">
+    <w:p>
+      <w:pPr>
+        <w:spacing w:before="0" w:after="0"/>
+      </w:pPr>
+      <w:r>
+        <w:continuationSeparator/>
+      </w:r>
+    </w:p>
+  </w:footnote>
+</w:footnotes>
+</file>
+
+<file path=word/header1.xml><?xml version="1.0" encoding="utf-8"?>
+<w:hdr xmlns:wpc="http://schemas.microsoft.com/office/word/2010/wordprocessingCanvas" xmlns:cx="http://schemas.microsoft.com/office/drawing/2014/chartex" xmlns:cx1="http://schemas.microsoft.com/office/drawing/2015/9/8/chartex" xmlns:cx2="http://schemas.microsoft.com/office/drawing/2015/10/21/chartex" xmlns:cx3="http://schemas.microsoft.com/office/drawing/2016/5/9/chartex" xmlns:cx4="http://schemas.microsoft.com/office/drawing/2016/5/10/chartex" xmlns:cx5="http://schemas.microsoft.com/office/drawing/2016/5/11/chartex" xmlns:cx6="http://schemas.microsoft.com/office/drawing/2016/5/12/chartex" xmlns:cx7="http://schemas.microsoft.com/office/drawing/2016/5/13/chartex" xmlns:cx8="http://schemas.microsoft.com/office/drawing/2016/5/14/chartex" xmlns:mc="http://schemas.openxmlformats.org/markup-compatibility/2006" xmlns:aink="http://schemas.microsoft.com/office/drawing/2016/ink" xmlns:am3d="http://schemas.microsoft.com/office/drawing/2017/model3d" xmlns:o="urn:schemas-microsoft-com:office:office" xmlns:oel="http://schemas.microsoft.com/office/2019/extlst" xmlns:r="http://schemas.openxmlformats.org/officeDocument/2006/relationships" xmlns:m="http://schemas.openxmlformats.org/officeDocument/2006/math" xmlns:v="urn:schemas-microsoft-com:vml" xmlns:wp14="http://schemas.microsoft.com/office/word/2010/wordprocessingDrawing" xmlns:wp="http://schemas.openxmlformats.org/drawingml/2006/wordprocessingDrawing" xmlns:w10="urn:schemas-microsoft-com:office:word" xmlns:w="http://schemas.openxmlformats.org/wordprocessingml/2006/main" xmlns:w14="http://schemas.microsoft.com/office/word/2010/wordml" xmlns:w15="http://schemas.microsoft.com/office/word/2012/wordml" xmlns:w16cex="http://schemas.microsoft.com/office/word/2018/wordml/cex" xmlns:w16cid="http://schemas.microsoft.com/office/word/2016/wordml/cid" xmlns:w16="http://schemas.microsoft.com/office/word/2018/wordml" xmlns:w16du="http://schemas.microsoft.com/office/word/2023/wordml/word16du" xmlns:w16sdtdh="http://schemas.microsoft.com/office/word/2020/wordml/sdtdatahash" xmlns:w16sdtfl="http://schemas.microsoft.com/office/word/2024/wordml/sdtformatlock" xmlns:w16se="http://schemas.microsoft.com/office/word/2015/wordml/symex" xmlns:wpg="http://schemas.microsoft.com/office/word/2010/wordprocessingGroup" xmlns:wpi="http://schemas.microsoft.com/office/word/2010/wordprocessingInk" xmlns:wne="http://schemas.microsoft.com/office/word/2006/wordml" xmlns:wps="http://schemas.microsoft.com/office/word/2010/wordprocessingShape" mc:Ignorable="w14 w15 w16se w16cid w16 w16cex w16sdtdh w16sdtfl w16du wp14">
+  <w:p>
+    <w:pPr>
+      <w:pStyle w:val="Header"/>
+    </w:pPr>
+  </w:p>
+</w:hdr>
+</file>
+
+<file path=word/header2.xml><?xml version="1.0" encoding="utf-8"?>
+<w:hdr xmlns:wpc="http://schemas.microsoft.com/office/word/2010/wordprocessingCanvas" xmlns:cx="http://schemas.microsoft.com/office/drawing/2014/chartex" xmlns:cx1="http://schemas.microsoft.com/office/drawing/2015/9/8/chartex" xmlns:cx2="http://schemas.microsoft.com/office/drawing/2015/10/21/chartex" xmlns:cx3="http://schemas.microsoft.com/office/drawing/2016/5/9/chartex" xmlns:cx4="http://schemas.microsoft.com/office/drawing/2016/5/10/chartex" xmlns:cx5="http://schemas.microsoft.com/office/drawing/2016/5/11/chartex" xmlns:cx6="http://schemas.microsoft.com/office/drawing/2016/5/12/chartex" xmlns:cx7="http://schemas.microsoft.com/office/drawing/2016/5/13/chartex" xmlns:cx8="http://schemas.microsoft.com/office/drawing/2016/5/14/chartex" xmlns:mc="http://schemas.openxmlformats.org/markup-compatibility/2006" xmlns:aink="http://schemas.microsoft.com/office/drawing/2016/ink" xmlns:am3d="http://schemas.microsoft.com/office/drawing/2017/model3d" xmlns:o="urn:schemas-microsoft-com:office:office" xmlns:oel="http://schemas.microsoft.com/office/2019/extlst" xmlns:r="http://schemas.openxmlformats.org/officeDocument/2006/relationships" xmlns:m="http://schemas.openxmlformats.org/officeDocument/2006/math" xmlns:v="urn:schemas-microsoft-com:vml" xmlns:wp14="http://schemas.microsoft.com/office/word/2010/wordprocessingDrawing" xmlns:wp="http://schemas.openxmlformats.org/drawingml/2006/wordprocessingDrawing" xmlns:w10="urn:schemas-microsoft-com:office:word" xmlns:w="http://schemas.openxmlformats.org/wordprocessingml/2006/main" xmlns:w14="http://schemas.microsoft.com/office/word/2010/wordml" xmlns:w15="http://schemas.microsoft.com/office/word/2012/wordml" xmlns:w16cex="http://schemas.microsoft.com/office/word/2018/wordml/cex" xmlns:w16cid="http://schemas.microsoft.com/office/word/2016/wordml/cid" xmlns:w16="http://schemas.microsoft.com/office/word/2018/wordml" xmlns:w16du="http://schemas.microsoft.com/office/word/2023/wordml/word16du" xmlns:w16sdtdh="http://schemas.microsoft.com/office/word/2020/wordml/sdtdatahash" xmlns:w16sdtfl="http://schemas.microsoft.com/office/word/2024/wordml/sdtformatlock" xmlns:w16se="http://schemas.microsoft.com/office/word/2015/wordml/symex" xmlns:wpg="http://schemas.microsoft.com/office/word/2010/wordprocessingGroup" xmlns:wpi="http://schemas.microsoft.com/office/word/2010/wordprocessingInk" xmlns:wne="http://schemas.microsoft.com/office/word/2006/wordml" xmlns:wps="http://schemas.microsoft.com/office/word/2010/wordprocessingShape" mc:Ignorable="w14 w15 w16se w16cid w16 w16cex w16sdtdh w16sdtfl w16du wp14">
+  <w:p>
+    <w:pPr>
+      <w:pStyle w:val="Header"/>
+    </w:pPr>
+  </w:p>
+</w:hdr>
+</file>
+
+<file path=word/header3.xml><?xml version="1.0" encoding="utf-8"?>
+<w:hdr xmlns:wpc="http://schemas.microsoft.com/office/word/2010/wordprocessingCanvas" xmlns:cx="http://schemas.microsoft.com/office/drawing/2014/chartex" xmlns:cx1="http://schemas.microsoft.com/office/drawing/2015/9/8/chartex" xmlns:cx2="http://schemas.microsoft.com/office/drawing/2015/10/21/chartex" xmlns:cx3="http://schemas.microsoft.com/office/drawing/2016/5/9/chartex" xmlns:cx4="http://schemas.microsoft.com/office/drawing/2016/5/10/chartex" xmlns:cx5="http://schemas.microsoft.com/office/drawing/2016/5/11/chartex" xmlns:cx6="http://schemas.microsoft.com/office/drawing/2016/5/12/chartex" xmlns:cx7="http://schemas.microsoft.com/office/drawing/2016/5/13/chartex" xmlns:cx8="http://schemas.microsoft.com/office/drawing/2016/5/14/chartex" xmlns:mc="http://schemas.openxmlformats.org/markup-compatibility/2006" xmlns:aink="http://schemas.microsoft.com/office/drawing/2016/ink" xmlns:am3d="http://schemas.microsoft.com/office/drawing/2017/model3d" xmlns:o="urn:schemas-microsoft-com:office:office" xmlns:oel="http://schemas.microsoft.com/office/2019/extlst" xmlns:r="http://schemas.openxmlformats.org/officeDocument/2006/relationships" xmlns:m="http://schemas.openxmlformats.org/officeDocument/2006/math" xmlns:v="urn:schemas-microsoft-com:vml" xmlns:wp14="http://schemas.microsoft.com/office/word/2010/wordprocessingDrawing" xmlns:wp="http://schemas.openxmlformats.org/drawingml/2006/wordprocessingDrawing" xmlns:w10="urn:schemas-microsoft-com:office:word" xmlns:w="http://schemas.openxmlformats.org/wordprocessingml/2006/main" xmlns:w14="http://schemas.microsoft.com/office/word/2010/wordml" xmlns:w15="http://schemas.microsoft.com/office/word/2012/wordml" xmlns:w16cex="http://schemas.microsoft.com/office/word/2018/wordml/cex" xmlns:w16cid="http://schemas.microsoft.com/office/word/2016/wordml/cid" xmlns:w16="http://schemas.microsoft.com/office/word/2018/wordml" xmlns:w16du="http://schemas.microsoft.com/office/word/2023/wordml/word16du" xmlns:w16sdtdh="http://schemas.microsoft.com/office/word/2020/wordml/sdtdatahash" xmlns:w16sdtfl="http://schemas.microsoft.com/office/word/2024/wordml/sdtformatlock" xmlns:w16se="http://schemas.microsoft.com/office/word/2015/wordml/symex" xmlns:wpg="http://schemas.microsoft.com/office/word/2010/wordprocessingGroup" xmlns:wpi="http://schemas.microsoft.com/office/word/2010/wordprocessingInk" xmlns:wne="http://schemas.microsoft.com/office/word/2006/wordml" xmlns:wps="http://schemas.microsoft.com/office/word/2010/wordprocessingShape" mc:Ignorable="w14 w15 w16se w16cid w16 w16cex w16sdtdh w16sdtfl w16du wp14">
+  <w:p>
+    <w:pPr>
+      <w:pStyle w:val="Header"/>
+    </w:pPr>
+  </w:p>
+</w:hdr>
 </file>
 
 <file path=word/numbering.xml><?xml version="1.0" encoding="utf-8"?>
@@ -24342,6 +24468,14 @@
 </w:numbering>
 </file>
 
+<file path=word/people.xml><?xml version="1.0" encoding="utf-8"?>
+<w15:people xmlns:wpc="http://schemas.microsoft.com/office/word/2010/wordprocessingCanvas" xmlns:cx="http://schemas.microsoft.com/office/drawing/2014/chartex" xmlns:cx1="http://schemas.microsoft.com/office/drawing/2015/9/8/chartex" xmlns:cx2="http://schemas.microsoft.com/office/drawing/2015/10/21/chartex" xmlns:cx3="http://schemas.microsoft.com/office/drawing/2016/5/9/chartex" xmlns:cx4="http://schemas.microsoft.com/office/drawing/2016/5/10/chartex" xmlns:cx5="http://schemas.microsoft.com/office/drawing/2016/5/11/chartex" xmlns:cx6="http://schemas.microsoft.com/office/drawing/2016/5/12/chartex" xmlns:cx7="http://schemas.microsoft.com/office/drawing/2016/5/13/chartex" xmlns:cx8="http://schemas.microsoft.com/office/drawing/2016/5/14/chartex" xmlns:mc="http://schemas.openxmlformats.org/markup-compatibility/2006" xmlns:aink="http://schemas.microsoft.com/office/drawing/2016/ink" xmlns:am3d="http://schemas.microsoft.com/office/drawing/2017/model3d" xmlns:o="urn:schemas-microsoft-com:office:office" xmlns:oel="http://schemas.microsoft.com/office/2019/extlst" xmlns:r="http://schemas.openxmlformats.org/officeDocument/2006/relationships" xmlns:m="http://schemas.openxmlformats.org/officeDocument/2006/math" xmlns:v="urn:schemas-microsoft-com:vml" xmlns:wp14="http://schemas.microsoft.com/office/word/2010/wordprocessingDrawing" xmlns:wp="http://schemas.openxmlformats.org/drawingml/2006/wordprocessingDrawing" xmlns:w10="urn:schemas-microsoft-com:office:word" xmlns:w="http://schemas.openxmlformats.org/wordprocessingml/2006/main" xmlns:w14="http://schemas.microsoft.com/office/word/2010/wordml" xmlns:w15="http://schemas.microsoft.com/office/word/2012/wordml" xmlns:w16cex="http://schemas.microsoft.com/office/word/2018/wordml/cex" xmlns:w16cid="http://schemas.microsoft.com/office/word/2016/wordml/cid" xmlns:w16="http://schemas.microsoft.com/office/word/2018/wordml" xmlns:w16du="http://schemas.microsoft.com/office/word/2023/wordml/word16du" xmlns:w16sdtdh="http://schemas.microsoft.com/office/word/2020/wordml/sdtdatahash" xmlns:w16sdtfl="http://schemas.microsoft.com/office/word/2024/wordml/sdtformatlock" xmlns:w16se="http://schemas.microsoft.com/office/word/2015/wordml/symex" xmlns:wpg="http://schemas.microsoft.com/office/word/2010/wordprocessingGroup" xmlns:wpi="http://schemas.microsoft.com/office/word/2010/wordprocessingInk" xmlns:wne="http://schemas.microsoft.com/office/word/2006/wordml" xmlns:wps="http://schemas.microsoft.com/office/word/2010/wordprocessingShape" mc:Ignorable="w14 w15 w16se w16cid w16 w16cex w16sdtdh w16sdtfl w16du wp14">
+  <w15:person w15:author="Martinelli, Adriano Luca (DBMR)">
+    <w15:presenceInfo w15:providerId="AD" w15:userId="S::adriano.martinelli@unibe.ch::1531e9e7-be29-445a-8555-ca80e715f55a"/>
+  </w15:person>
+</w15:people>
+</file>
+
 <file path=word/styles.xml><?xml version="1.0" encoding="utf-8"?>
 <w:styles xmlns:mc="http://schemas.openxmlformats.org/markup-compatibility/2006" xmlns:r="http://schemas.openxmlformats.org/officeDocument/2006/relationships" xmlns:w="http://schemas.openxmlformats.org/wordprocessingml/2006/main" xmlns:w14="http://schemas.microsoft.com/office/word/2010/wordml" xmlns:w15="http://schemas.microsoft.com/office/word/2012/wordml" xmlns:w16cex="http://schemas.microsoft.com/office/word/2018/wordml/cex" xmlns:w16cid="http://schemas.microsoft.com/office/word/2016/wordml/cid" xmlns:w16="http://schemas.microsoft.com/office/word/2018/wordml" xmlns:w16du="http://schemas.microsoft.com/office/word/2023/wordml/word16du" xmlns:w16sdtdh="http://schemas.microsoft.com/office/word/2020/wordml/sdtdatahash" xmlns:w16sdtfl="http://schemas.microsoft.com/office/word/2024/wordml/sdtformatlock" xmlns:w16se="http://schemas.microsoft.com/office/word/2015/wordml/symex" mc:Ignorable="w14 w15 w16se w16cid w16 w16cex w16sdtdh w16sdtfl w16du">
   <w:docDefaults>
@@ -24813,6 +24947,7 @@
   <w:style w:type="character" w:default="1" w:styleId="DefaultParagraphFont">
     <w:name w:val="Default Paragraph Font"/>
     <w:uiPriority w:val="1"/>
+    <w:semiHidden/>
     <w:unhideWhenUsed/>
   </w:style>
   <w:style w:type="table" w:default="1" w:styleId="TableNormal">
@@ -26406,6 +26541,50 @@
       <w:shd w:val="clear" w:color="auto" w:fill="E1DFDD"/>
     </w:rPr>
   </w:style>
+  <w:style w:type="paragraph" w:styleId="Header">
+    <w:name w:val="header"/>
+    <w:basedOn w:val="Normal"/>
+    <w:link w:val="HeaderChar"/>
+    <w:rsid w:val="00CD576F"/>
+    <w:pPr>
+      <w:tabs>
+        <w:tab w:val="center" w:pos="4680"/>
+        <w:tab w:val="right" w:pos="9360"/>
+      </w:tabs>
+      <w:spacing w:before="0" w:after="0"/>
+    </w:pPr>
+  </w:style>
+  <w:style w:type="character" w:customStyle="1" w:styleId="HeaderChar">
+    <w:name w:val="Header Char"/>
+    <w:basedOn w:val="DefaultParagraphFont"/>
+    <w:link w:val="Header"/>
+    <w:rsid w:val="00CD576F"/>
+    <w:rPr>
+      <w:rFonts w:eastAsia="Aptos" w:cs="Aptos"/>
+    </w:rPr>
+  </w:style>
+  <w:style w:type="paragraph" w:styleId="Footer">
+    <w:name w:val="footer"/>
+    <w:basedOn w:val="Normal"/>
+    <w:link w:val="FooterChar"/>
+    <w:rsid w:val="00CD576F"/>
+    <w:pPr>
+      <w:tabs>
+        <w:tab w:val="center" w:pos="4680"/>
+        <w:tab w:val="right" w:pos="9360"/>
+      </w:tabs>
+      <w:spacing w:before="0" w:after="0"/>
+    </w:pPr>
+  </w:style>
+  <w:style w:type="character" w:customStyle="1" w:styleId="FooterChar">
+    <w:name w:val="Footer Char"/>
+    <w:basedOn w:val="DefaultParagraphFont"/>
+    <w:link w:val="Footer"/>
+    <w:rsid w:val="00CD576F"/>
+    <w:rPr>
+      <w:rFonts w:eastAsia="Aptos" w:cs="Aptos"/>
+    </w:rPr>
+  </w:style>
 </w:styles>
 </file>
 
@@ -26583,6 +26762,28 @@
 </a:theme>
 </file>
 
+<file path=word/webextensions/taskpanes.xml><?xml version="1.0" encoding="utf-8"?>
+<wetp:taskpanes xmlns:wetp="http://schemas.microsoft.com/office/webextensions/taskpanes/2010/11">
+  <wetp:taskpane dockstate="right" visibility="0" width="350" row="0">
+    <wetp:webextensionref xmlns:r="http://schemas.openxmlformats.org/officeDocument/2006/relationships" r:id="rId1"/>
+  </wetp:taskpane>
+</wetp:taskpanes>
+</file>
+
+<file path=word/webextensions/webextension1.xml><?xml version="1.0" encoding="utf-8"?>
+<we:webextension xmlns:we="http://schemas.microsoft.com/office/webextensions/webextension/2010/11" id="{764DF28B-210E-674F-9C43-6FE44FA11683}">
+  <we:reference id="wa200010453" version="1.0.0.1" store="en-US" storeType="OMEX"/>
+  <we:alternateReferences>
+    <we:reference id="WA200010453" version="1.0.0.1" store="WA200010453" storeType="OMEX"/>
+  </we:alternateReferences>
+  <we:properties>
+    <we:property name="claude.fileId" value="&quot;77c83d58-f22a-4b53-ac73-e9f0149b4623&quot;"/>
+  </we:properties>
+  <we:bindings/>
+  <we:snapshot xmlns:r="http://schemas.openxmlformats.org/officeDocument/2006/relationships"/>
+</we:webextension>
+</file>
+
 <file path=customXml/item1.xml><?xml version="1.0" encoding="utf-8"?>
 <b:Sources xmlns:b="http://schemas.openxmlformats.org/officeDocument/2006/bibliography" xmlns="http://schemas.openxmlformats.org/officeDocument/2006/bibliography" SelectedStyle="/APASixthEditionOfficeOnline.xsl" StyleName="APA" Version="6"/>
 </file>

</xml_diff>